<commit_message>
Improve Paper 3 reproducibility and PMU ingestion
</commit_message>
<xml_diff>
--- a/papers/CNNLSTM_ModelValidation_MOD026_AcademicPaper_2026-09-08.docx
+++ b/papers/CNNLSTM_ModelValidation_MOD026_AcademicPaper_2026-09-08.docx
@@ -13,7 +13,7 @@
           <w:i w:val="0"/>
           <w:sz w:val="32"/>
         </w:rPr>
-        <w:t>Event-Based Model Validation for NERC MOD-026-2 and MOD-033 Using Physics-Informed CNN-LSTM and Simulated PMU Data</w:t>
+        <w:t>Event-Based Model Validation for NERC MOD-026-2 and MOD-033 Using a Physics-Informed CNN-LSTM Surrogate and Simulated PMU Data</w:t>
       </w:r>
     </w:p>
     <w:p/>
@@ -94,7 +94,7 @@
           <w:i/>
           <w:sz w:val="22"/>
         </w:rPr>
-        <w:t>NERC MOD-026-2 (excitation system model verification) and MOD-033 (steady-state and dynamic system model validation) require that planning and operations models be checked against measured event data, but the comparison is still predominantly performed by visual inspection of simulated and recorded trajectories. We propose an automated, interpretable discrepancy-detection pipeline that pairs a physics-informed CNN-LSTM trajectory predictor with an autoencoder-based novelty detector and a sensitivity-trained attribution head. Because the sandbox used in this study does not include PyTorch, the CNN-LSTM is implemented as an sklearn MLPRegressor trained on windowed-trajectory statistical features; we refer to this model throughout as the CNN-LSTM-equivalent surrogate and document the substitution transparently. We generate a synthetic PMU event dataset of 880 events (line trips, generator trips, and three-phase faults) from a two-machine equivalent swing + exciter model solved with scipy.integrate.solve_ivp, and we inject controlled parameter errors in inertia (H, ±20%), damping (D, ±20%), and exciter gain (K_A, ±30%) to create wrong-model cases. On a 30% held-out test set the trajectory surrogate achieves an RMSE of 0.0015 pu, the autoencoder novelty detector achieves a binary accuracy of 0.814 with a ROC-AUC of 0.993, and the sensitivity-based attribution reaches an overall accuracy of 0.674 on flagged cases, with perfect detection of H and D errors but a known weakness on K_A errors that we trace to the small voltage-recovery signature of the slow-AVR configuration used in this study. The pipeline demonstrates that an automated mismatch detector can support MOD-026-2 and MOD-033 compliance workflows while preserving engineering interpretability, and we discuss concrete next steps for field deployment on real PMU data.</w:t>
+        <w:t>NERC MOD-026-2 (excitation system model verification) and MOD-033 (steady-state and dynamic system model validation) require that planning and operations models be checked against measured event data, but the comparison is still predominantly performed by visual inspection of simulated and recorded trajectories. We propose an automated, interpretable discrepancy-detection pipeline that pairs a physics-informed CNN-LSTM-equivalent trajectory surrogate with an autoencoder-based novelty detector and a sensitivity-trained attribution head. Because the sandbox used in this study does not include PyTorch, the CNN-LSTM is implemented as an sklearn MLPRegressor trained on windowed-trajectory statistical features; we refer to this model throughout as the CNN-LSTM-equivalent surrogate and document the substitution transparently. We generate a synthetic PMU event dataset of 880 events (line trips, generator trips, and three-phase faults) from a two-machine equivalent swing + exciter model solved with scipy.integrate.solve_ivp, and we inject controlled parameter errors in inertia (H, ±20%), damping (D, ±20%), and exciter gain (K_A, ±30%) to create wrong-model cases. On a 30% held-out test set the trajectory surrogate achieves an RMSE of 0.0006 pu, the autoencoder novelty detector achieves a binary accuracy of 0.814 with a ROC-AUC of 0.983, and the sensitivity-based attribution reaches an overall accuracy of 0.674 on flagged cases, with perfect detection of H and D errors but a known weakness on K_A errors that we trace to the small voltage-recovery signature of the slow-AVR configuration used in this study. A repo-level PMU CSV schema is included to support replacement of the synthetic event generator by recorded PMU events when matched simulation and parameter-label metadata are available. The pipeline demonstrates that an automated mismatch detector can support MOD-026-2 and MOD-033 compliance workflows while preserving engineering interpretability, and we discuss concrete next steps for field deployment on real PMU data without over-claiming field validation from the synthetic benchmark alone.</w:t>
       </w:r>
     </w:p>
     <w:p>
@@ -2027,7 +2027,7 @@
           <w:i w:val="0"/>
           <w:sz w:val="24"/>
         </w:rPr>
-        <w:t>The CNN-LSTM-equivalent surrogate achieves a held-out test-set trajectory RMSE of 0.0015 pu, which is well below the 0.01 pu tolerance typically used for MOD-026-2 compliance reporting. Figure 1 illustrates the simulated (nominal-model) versus synthetic-PMU (H-20% error) voltage trajectory for a representative three-phase fault at the machine-1 bus, with the discrepancy highlighted as a shaded region between the two curves. The discrepancy is most pronounced during the first inter-area oscillation cycle (0.5-1.0 s post-event), which is the window in which an inertia error produces its largest trajectory signature. The visual contrast in Figure 1 is representative of the average H-error event in our test set, and it confirms that the two-machine equivalent generates physically plausible trajectory divergences for the parameter errors under study.</w:t>
+        <w:t>The CNN-LSTM-equivalent surrogate achieves a held-out test-set trajectory RMSE of 0.0006 pu, which is well below the 0.01 pu tolerance typically used for MOD-026-2 compliance reporting. Figure 1 illustrates the simulated (nominal-model) versus synthetic-PMU (H-20% error) voltage trajectory for a representative three-phase fault at the machine-1 bus, with the discrepancy highlighted as a shaded region between the two curves. The discrepancy is most pronounced during the first inter-area oscillation cycle (0.5-1.0 s post-event), which is the window in which an inertia error produces its largest trajectory signature. The visual contrast in Figure 1 is representative of the average H-error event in our test set, and it confirms that the two-machine equivalent generates physically plausible trajectory divergences for the parameter errors under study.</w:t>
       </w:r>
     </w:p>
     <w:p>
@@ -2101,7 +2101,7 @@
           <w:i w:val="0"/>
           <w:sz w:val="24"/>
         </w:rPr>
-        <w:t>The autoencoder novelty detector achieves a binary accuracy of 0.814 and a ROC-AUC of 0.993 on the held-out test set. The detection threshold, set to mean + 3*sigma of the in-distribution reconstruction error, is 1.886. Figure 2 shows the reconstruction-error histogram for correct-model events (green) and parameter-error events (red), with the threshold marked as a dashed vertical line. The two distributions are clearly separated, with the in-distribution events tightly concentrated below the threshold and the out-of-distribution events spread out above it. The near-perfect ROC-AUC indicates that the threshold could be shifted substantially without producing a large change in the false-positive rate, which is a desirable property for a compliance-oriented detector: it gives the model owner confidence that the alarm is robust to reasonable threshold choices.</w:t>
+        <w:t>The autoencoder novelty detector achieves a binary accuracy of 0.814 and a ROC-AUC of 0.983 on the held-out test set. The detection threshold, set to mean + 3*sigma of the in-distribution reconstruction error, is 1.436. Figure 2 shows the reconstruction-error histogram for correct-model events (green) and parameter-error events (red), with the threshold marked as a dashed vertical line. The two distributions are clearly separated, with the in-distribution events tightly concentrated below the threshold and the out-of-distribution events spread out above it. The near-perfect ROC-AUC indicates that the threshold could be shifted substantially without producing a large change in the false-positive rate, which is a desirable property for a compliance-oriented detector: it gives the model owner confidence that the alarm is robust to reasonable threshold choices.</w:t>
       </w:r>
     </w:p>
     <w:p>
@@ -2672,7 +2672,7 @@
       <w:r>
         <w:drawing>
           <wp:inline xmlns:a="http://schemas.openxmlformats.org/drawingml/2006/main" xmlns:pic="http://schemas.openxmlformats.org/drawingml/2006/picture">
-            <wp:extent cx="4206240" cy="3684847"/>
+            <wp:extent cx="4206240" cy="3700283"/>
             <wp:docPr id="3" name="Picture 3"/>
             <wp:cNvGraphicFramePr>
               <a:graphicFrameLocks noChangeAspect="1"/>
@@ -2693,7 +2693,7 @@
                   <pic:spPr>
                     <a:xfrm>
                       <a:off x="0" y="0"/>
-                      <a:ext cx="4206240" cy="3684847"/>
+                      <a:ext cx="4206240" cy="3700283"/>
                     </a:xfrm>
                     <a:prstGeom prst="rect"/>
                   </pic:spPr>
@@ -2955,7 +2955,7 @@
       <w:r>
         <w:drawing>
           <wp:inline xmlns:a="http://schemas.openxmlformats.org/drawingml/2006/main" xmlns:pic="http://schemas.openxmlformats.org/drawingml/2006/picture">
-            <wp:extent cx="5120640" cy="4030557"/>
+            <wp:extent cx="5120640" cy="4001921"/>
             <wp:docPr id="4" name="Picture 4"/>
             <wp:cNvGraphicFramePr>
               <a:graphicFrameLocks noChangeAspect="1"/>
@@ -2976,7 +2976,7 @@
                   <pic:spPr>
                     <a:xfrm>
                       <a:off x="0" y="0"/>
-                      <a:ext cx="5120640" cy="4030557"/>
+                      <a:ext cx="5120640" cy="4001921"/>
                     </a:xfrm>
                     <a:prstGeom prst="rect"/>
                   </pic:spPr>
@@ -3151,7 +3151,7 @@
           <w:i w:val="0"/>
           <w:sz w:val="24"/>
         </w:rPr>
-        <w:t>We have presented an automated, interpretable discrepancy-detection pipeline for NERC MOD-026-2 and MOD-033 model validation, combining a CNN-LSTM-equivalent trajectory surrogate (implemented as an sklearn MLPRegressor for sandbox compatibility), an autoencoder novelty detector, and a sensitivity-trained attribution head. On a synthetic PMU event dataset of 880 events with controlled parameter errors in H, D, and K_A, the pipeline achieves a binary novelty accuracy of 0.814, a ROC-AUC of 0.993, and an overall attribution accuracy of 0.674. H and D errors are detected and attributed with perfect accuracy, while K_A errors are not, due to the slow-AVR configuration used in this study. The pipeline is fully reproducible (fixed random seed, open-source Python, sandbox-compatible dependencies) and runs in approximately 90 s on a single CPU core.</w:t>
+        <w:t>We have presented an automated, interpretable discrepancy-detection pipeline for NERC MOD-026-2 and MOD-033 model validation, combining a CNN-LSTM-equivalent trajectory surrogate (implemented as an sklearn MLPRegressor for sandbox compatibility), an autoencoder novelty detector, and a sensitivity-trained attribution head. On a synthetic PMU event dataset of 880 events with controlled parameter errors in H, D, and K_A, the pipeline achieves a binary novelty accuracy of 0.814, a ROC-AUC of 0.983, and an overall attribution accuracy of 0.674. H and D errors are detected and attributed with perfect accuracy, while K_A errors are not, due to the slow-AVR configuration used in this study. The pipeline is fully reproducible (fixed random seed, open-source Python, sandbox-compatible dependencies) and runs in approximately 90 s on a single CPU core.</w:t>
       </w:r>
     </w:p>
     <w:p>
@@ -3379,7 +3379,7 @@
           <w:i w:val="0"/>
           <w:sz w:val="24"/>
         </w:rPr>
-        <w:t>To reproduce the results, run the two scripts in sequence: `python paper3_cnnlstm_model_validation.py` produces the figures and tables under /home/z/my-project/download/figures/, and `python paper3_assemble_docx.py` produces the Word document at /home/z/my-project/download/papers/CNNLSTM_ModelValidation_MOD026_AcademicPaper_2026-09-08.docx. The expected wall-clock time for the simulation script is approximately 90 s on a single CPU core; the assembly script completes in a few seconds. The figures are saved at 300 DPI in PNG format and are sized to fit a 6-inch column width.</w:t>
+        <w:t>To reproduce the results from a repository clone, run the two scripts in sequence from the repository root: `python scripts/paper3_cnnlstm_model_validation.py` produces the figures and tables under figures/, and `python scripts/paper3_assemble_docx.py` produces the Word document at papers/CNNLSTM_ModelValidation_MOD026_AcademicPaper_2026-09-08.docx. The expected wall-clock time for the simulation script is approximately 90 s on a single CPU core; the assembly script completes in a few seconds. The figures are saved at 300 DPI in PNG format and are sized to fit a 6-inch column width.</w:t>
       </w:r>
     </w:p>
     <w:p>
@@ -3393,7 +3393,7 @@
           <w:i w:val="0"/>
           <w:sz w:val="24"/>
         </w:rPr>
-        <w:t>The dependencies required to run the pipeline are: numpy, pandas, scipy, scikit-learn, matplotlib, and python-docx. The full requirements list is available in /home/z/my-project/download/requirements.txt. The figures, CSV summaries, and JSON summary are the only artifacts required by the assembly script; the Python source of paper3_cnnlstm_model_validation.py is reproduced in Appendix B for completeness.</w:t>
+        <w:t>The dependencies required to run the pipeline are: numpy, pandas, scipy, scikit-learn, matplotlib, and python-docx. The full requirements list is available in requirements.txt. The figures, CSV summaries, and JSON summary are the only artifacts required by the assembly script; the Python source of paper3_cnnlstm_model_validation.py is reproduced in Appendix B for completeness.</w:t>
       </w:r>
     </w:p>
     <w:p>
@@ -3823,18 +3823,6 @@
                 <w:rFonts w:ascii="Consolas" w:hAnsi="Consolas" w:eastAsia="Consolas" w:cs="Consolas"/>
                 <w:sz w:val="18"/>
               </w:rPr>
-              <w:t>import os</w:t>
-            </w:r>
-          </w:p>
-          <w:p>
-            <w:pPr>
-              <w:jc w:val="left"/>
-            </w:pPr>
-            <w:r>
-              <w:rPr>
-                <w:rFonts w:ascii="Consolas" w:hAnsi="Consolas" w:eastAsia="Consolas" w:cs="Consolas"/>
-                <w:sz w:val="18"/>
-              </w:rPr>
               <w:t>import json</w:t>
             </w:r>
           </w:p>
@@ -3871,6 +3859,18 @@
                 <w:rFonts w:ascii="Consolas" w:hAnsi="Consolas" w:eastAsia="Consolas" w:cs="Consolas"/>
                 <w:sz w:val="18"/>
               </w:rPr>
+              <w:t>from pathlib import Path</w:t>
+            </w:r>
+          </w:p>
+          <w:p>
+            <w:pPr>
+              <w:jc w:val="left"/>
+            </w:pPr>
+            <w:r>
+              <w:rPr>
+                <w:rFonts w:ascii="Consolas" w:hAnsi="Consolas" w:eastAsia="Consolas" w:cs="Consolas"/>
+                <w:sz w:val="18"/>
+              </w:rPr>
               <w:t>from typing import Tuple, Dict, List</w:t>
             </w:r>
           </w:p>
@@ -4179,19 +4179,31 @@
                 <w:rFonts w:ascii="Consolas" w:hAnsi="Consolas" w:eastAsia="Consolas" w:cs="Consolas"/>
                 <w:sz w:val="18"/>
               </w:rPr>
-              <w:t>FIG_DIR = "/home/z/my-project/download/figures"</w:t>
-            </w:r>
-          </w:p>
-          <w:p>
-            <w:pPr>
-              <w:jc w:val="left"/>
-            </w:pPr>
-            <w:r>
-              <w:rPr>
-                <w:rFonts w:ascii="Consolas" w:hAnsi="Consolas" w:eastAsia="Consolas" w:cs="Consolas"/>
-                <w:sz w:val="18"/>
-              </w:rPr>
-              <w:t>os.makedirs(FIG_DIR, exist_ok=True)</w:t>
+              <w:t>REPO_ROOT = Path(__file__).resolve().parents[1]</w:t>
+            </w:r>
+          </w:p>
+          <w:p>
+            <w:pPr>
+              <w:jc w:val="left"/>
+            </w:pPr>
+            <w:r>
+              <w:rPr>
+                <w:rFonts w:ascii="Consolas" w:hAnsi="Consolas" w:eastAsia="Consolas" w:cs="Consolas"/>
+                <w:sz w:val="18"/>
+              </w:rPr>
+              <w:t>FIG_DIR = REPO_ROOT / "figures"</w:t>
+            </w:r>
+          </w:p>
+          <w:p>
+            <w:pPr>
+              <w:jc w:val="left"/>
+            </w:pPr>
+            <w:r>
+              <w:rPr>
+                <w:rFonts w:ascii="Consolas" w:hAnsi="Consolas" w:eastAsia="Consolas" w:cs="Consolas"/>
+                <w:sz w:val="18"/>
+              </w:rPr>
+              <w:t>FIG_DIR.mkdir(parents=True, exist_ok=True)</w:t>
             </w:r>
           </w:p>
           <w:p>
@@ -5265,6 +5277,17 @@
                 <w:rFonts w:ascii="Consolas" w:hAnsi="Consolas" w:eastAsia="Consolas" w:cs="Consolas"/>
                 <w:sz w:val="18"/>
               </w:rPr>
+            </w:r>
+          </w:p>
+          <w:p>
+            <w:pPr>
+              <w:jc w:val="left"/>
+            </w:pPr>
+            <w:r>
+              <w:rPr>
+                <w:rFonts w:ascii="Consolas" w:hAnsi="Consolas" w:eastAsia="Consolas" w:cs="Consolas"/>
+                <w:sz w:val="18"/>
+              </w:rPr>
               <w:t># ----------------------------------------------------------------------</w:t>
             </w:r>
           </w:p>
@@ -6171,17 +6194,6 @@
                 <w:sz w:val="18"/>
               </w:rPr>
               <w:t xml:space="preserve">    }</w:t>
-            </w:r>
-          </w:p>
-          <w:p>
-            <w:pPr>
-              <w:jc w:val="left"/>
-            </w:pPr>
-            <w:r>
-              <w:rPr>
-                <w:rFonts w:ascii="Consolas" w:hAnsi="Consolas" w:eastAsia="Consolas" w:cs="Consolas"/>
-                <w:sz w:val="18"/>
-              </w:rPr>
             </w:r>
           </w:p>
         </w:tc>
@@ -6225,6 +6237,17 @@
                 <w:rFonts w:ascii="Consolas" w:hAnsi="Consolas" w:eastAsia="Consolas" w:cs="Consolas"/>
                 <w:sz w:val="18"/>
               </w:rPr>
+            </w:r>
+          </w:p>
+          <w:p>
+            <w:pPr>
+              <w:jc w:val="left"/>
+            </w:pPr>
+            <w:r>
+              <w:rPr>
+                <w:rFonts w:ascii="Consolas" w:hAnsi="Consolas" w:eastAsia="Consolas" w:cs="Consolas"/>
+                <w:sz w:val="18"/>
+              </w:rPr>
               <w:t># ----------------------------------------------------------------------</w:t>
             </w:r>
           </w:p>
@@ -7382,17 +7405,6 @@
                 <w:sz w:val="18"/>
               </w:rPr>
               <w:t xml:space="preserve">    return X, Y, lab, meta</w:t>
-            </w:r>
-          </w:p>
-          <w:p>
-            <w:pPr>
-              <w:jc w:val="left"/>
-            </w:pPr>
-            <w:r>
-              <w:rPr>
-                <w:rFonts w:ascii="Consolas" w:hAnsi="Consolas" w:eastAsia="Consolas" w:cs="Consolas"/>
-                <w:sz w:val="18"/>
-              </w:rPr>
             </w:r>
           </w:p>
         </w:tc>
@@ -7436,6 +7448,17 @@
                 <w:rFonts w:ascii="Consolas" w:hAnsi="Consolas" w:eastAsia="Consolas" w:cs="Consolas"/>
                 <w:sz w:val="18"/>
               </w:rPr>
+            </w:r>
+          </w:p>
+          <w:p>
+            <w:pPr>
+              <w:jc w:val="left"/>
+            </w:pPr>
+            <w:r>
+              <w:rPr>
+                <w:rFonts w:ascii="Consolas" w:hAnsi="Consolas" w:eastAsia="Consolas" w:cs="Consolas"/>
+                <w:sz w:val="18"/>
+              </w:rPr>
               <w:t># ----------------------------------------------------------------------</w:t>
             </w:r>
           </w:p>
@@ -7981,6 +8004,17 @@
                 <w:rFonts w:ascii="Consolas" w:hAnsi="Consolas" w:eastAsia="Consolas" w:cs="Consolas"/>
                 <w:sz w:val="18"/>
               </w:rPr>
+            </w:r>
+          </w:p>
+          <w:p>
+            <w:pPr>
+              <w:jc w:val="left"/>
+            </w:pPr>
+            <w:r>
+              <w:rPr>
+                <w:rFonts w:ascii="Consolas" w:hAnsi="Consolas" w:eastAsia="Consolas" w:cs="Consolas"/>
+                <w:sz w:val="18"/>
+              </w:rPr>
               <w:t># ----------------------------------------------------------------------</w:t>
             </w:r>
           </w:p>
@@ -8386,19 +8420,7 @@
                 <w:rFonts w:ascii="Consolas" w:hAnsi="Consolas" w:eastAsia="Consolas" w:cs="Consolas"/>
                 <w:sz w:val="18"/>
               </w:rPr>
-              <w:t xml:space="preserve">        C=1.0, multi_class="multinomial",</w:t>
-            </w:r>
-          </w:p>
-          <w:p>
-            <w:pPr>
-              <w:jc w:val="left"/>
-            </w:pPr>
-            <w:r>
-              <w:rPr>
-                <w:rFonts w:ascii="Consolas" w:hAnsi="Consolas" w:eastAsia="Consolas" w:cs="Consolas"/>
-                <w:sz w:val="18"/>
-              </w:rPr>
-              <w:t xml:space="preserve">        solver="lbfgs", random_state=RNG_SEED,</w:t>
+              <w:t xml:space="preserve">        C=1.0, solver="lbfgs", random_state=RNG_SEED,</w:t>
             </w:r>
           </w:p>
           <w:p>
@@ -11577,7 +11599,7 @@
                 <w:rFonts w:ascii="Consolas" w:hAnsi="Consolas" w:eastAsia="Consolas" w:cs="Consolas"/>
                 <w:sz w:val="18"/>
               </w:rPr>
-              <w:t xml:space="preserve">                           os.path.join(FIG_DIR, "paper3_fig1_trajectory_overlay.png"))</w:t>
+              <w:t xml:space="preserve">                            FIG_DIR / "paper3_fig1_trajectory_overlay.png")</w:t>
             </w:r>
           </w:p>
           <w:p>
@@ -11624,7 +11646,7 @@
                 <w:rFonts w:ascii="Consolas" w:hAnsi="Consolas" w:eastAsia="Consolas" w:cs="Consolas"/>
                 <w:sz w:val="18"/>
               </w:rPr>
-              <w:t xml:space="preserve">                     os.path.join(FIG_DIR, "paper3_fig2_ae_histogram.png"))</w:t>
+              <w:t xml:space="preserve">                     FIG_DIR / "paper3_fig2_ae_histogram.png")</w:t>
             </w:r>
           </w:p>
           <w:p>
@@ -11671,7 +11693,7 @@
                 <w:rFonts w:ascii="Consolas" w:hAnsi="Consolas" w:eastAsia="Consolas" w:cs="Consolas"/>
                 <w:sz w:val="18"/>
               </w:rPr>
-              <w:t xml:space="preserve">                  os.path.join(FIG_DIR, "paper3_fig3_confusion_matrix.png"))</w:t>
+              <w:t xml:space="preserve">                  FIG_DIR / "paper3_fig3_confusion_matrix.png")</w:t>
             </w:r>
           </w:p>
           <w:p>
@@ -11766,7 +11788,7 @@
                 <w:rFonts w:ascii="Consolas" w:hAnsi="Consolas" w:eastAsia="Consolas" w:cs="Consolas"/>
                 <w:sz w:val="18"/>
               </w:rPr>
-              <w:t xml:space="preserve">                            os.path.join(FIG_DIR, "paper3_fig4_sensitivity_heatmap.png"))</w:t>
+              <w:t xml:space="preserve">                            FIG_DIR / "paper3_fig4_sensitivity_heatmap.png")</w:t>
             </w:r>
           </w:p>
           <w:p>
@@ -12040,7 +12062,7 @@
                 <w:rFonts w:ascii="Consolas" w:hAnsi="Consolas" w:eastAsia="Consolas" w:cs="Consolas"/>
                 <w:sz w:val="18"/>
               </w:rPr>
-              <w:t xml:space="preserve">    with open(os.path.join(FIG_DIR, "paper3_summary.json"), "w") as f:</w:t>
+              <w:t xml:space="preserve">    with open(FIG_DIR / "paper3_summary.json", "w") as f:</w:t>
             </w:r>
           </w:p>
           <w:p>
@@ -12291,7 +12313,7 @@
                 <w:rFonts w:ascii="Consolas" w:hAnsi="Consolas" w:eastAsia="Consolas" w:cs="Consolas"/>
                 <w:sz w:val="18"/>
               </w:rPr>
-              <w:t xml:space="preserve">    scen_df.to_csv(os.path.join(FIG_DIR, "paper3_scenarios.csv"), index=False)</w:t>
+              <w:t xml:space="preserve">    scen_df.to_csv(FIG_DIR / "paper3_scenarios.csv", index=False)</w:t>
             </w:r>
           </w:p>
           <w:p>
@@ -12326,7 +12348,7 @@
                 <w:rFonts w:ascii="Consolas" w:hAnsi="Consolas" w:eastAsia="Consolas" w:cs="Consolas"/>
                 <w:sz w:val="18"/>
               </w:rPr>
-              <w:t xml:space="preserve">    df_metrics.to_csv(os.path.join(FIG_DIR, "paper3_metrics_by_class.csv"), index=False)</w:t>
+              <w:t xml:space="preserve">    df_metrics.to_csv(FIG_DIR / "paper3_metrics_by_class.csv", index=False)</w:t>
             </w:r>
           </w:p>
           <w:p>
@@ -12421,7 +12443,7 @@
                 <w:rFonts w:ascii="Consolas" w:hAnsi="Consolas" w:eastAsia="Consolas" w:cs="Consolas"/>
                 <w:sz w:val="18"/>
               </w:rPr>
-              <w:t xml:space="preserve">        os.path.join(FIG_DIR, "paper3_attribution.csv"), index=False)</w:t>
+              <w:t xml:space="preserve">        FIG_DIR / "paper3_attribution.csv", index=False)</w:t>
             </w:r>
           </w:p>
           <w:p>

</xml_diff>

<commit_message>
Add LBNL PMU case study to Paper 3
</commit_message>
<xml_diff>
--- a/papers/CNNLSTM_ModelValidation_MOD026_AcademicPaper_2026-09-08.docx
+++ b/papers/CNNLSTM_ModelValidation_MOD026_AcademicPaper_2026-09-08.docx
@@ -94,7 +94,7 @@
           <w:i/>
           <w:sz w:val="22"/>
         </w:rPr>
-        <w:t>NERC MOD-026-2 (excitation system model verification) and MOD-033 (steady-state and dynamic system model validation) require that planning and operations models be checked against measured event data, but the comparison is still predominantly performed by visual inspection of simulated and recorded trajectories. We propose an automated, interpretable discrepancy-detection pipeline that pairs a physics-informed CNN-LSTM-equivalent trajectory surrogate with an autoencoder-based novelty detector and a sensitivity-trained attribution head. Because the sandbox used in this study does not include PyTorch, the CNN-LSTM is implemented as an sklearn MLPRegressor trained on windowed-trajectory statistical features; we refer to this model throughout as the CNN-LSTM-equivalent surrogate and document the substitution transparently. We generate a synthetic PMU event dataset of 880 events (line trips, generator trips, and three-phase faults) from a two-machine equivalent swing + exciter model solved with scipy.integrate.solve_ivp, and we inject controlled parameter errors in inertia (H, ±20%), damping (D, ±20%), and exciter gain (K_A, ±30%) to create wrong-model cases. On a 30% held-out test set the trajectory surrogate achieves an RMSE of 0.0006 pu, the autoencoder novelty detector achieves a binary accuracy of 0.814 with a ROC-AUC of 0.983, and the sensitivity-based attribution reaches an overall accuracy of 0.674 on flagged cases, with perfect detection of H and D errors but a known weakness on K_A errors that we trace to the small voltage-recovery signature of the slow-AVR configuration used in this study. A repo-level PMU CSV schema is included to support replacement of the synthetic event generator by recorded PMU events when matched simulation and parameter-label metadata are available. The pipeline demonstrates that an automated mismatch detector can support MOD-026-2 and MOD-033 compliance workflows while preserving engineering interpretability, and we discuss concrete next steps for field deployment on real PMU data without over-claiming field validation from the synthetic benchmark alone.</w:t>
+        <w:t>NERC MOD-026-2 (excitation system model verification) and MOD-033 (steady-state and dynamic system model validation) require that planning and operations models be checked against measured event data, but the comparison is still predominantly performed by visual inspection of simulated and recorded trajectories. We propose an automated, interpretable discrepancy-detection pipeline that pairs a physics-informed CNN-LSTM-equivalent trajectory surrogate with an autoencoder-based novelty detector and a sensitivity-trained attribution head. Because the sandbox used in this study does not include PyTorch, the CNN-LSTM is implemented as an sklearn MLPRegressor trained on windowed-trajectory statistical features; we refer to this model throughout as the CNN-LSTM-equivalent surrogate and document the substitution transparently. We generate a synthetic PMU event dataset of 880 events (line trips, generator trips, and three-phase faults) from a two-machine equivalent swing + exciter model solved with scipy.integrate.solve_ivp, and we inject controlled parameter errors in inertia (H, ±20%), damping (D, ±20%), and exciter gain (K_A, ±30%) to create wrong-model cases. On a 30% held-out test set the trajectory surrogate achieves an RMSE of 0.0006 pu, the autoencoder novelty detector achieves a binary accuracy of 0.814 with a ROC-AUC of 0.983, and the sensitivity-based attribution reaches an overall accuracy of 0.674 on flagged cases, with perfect detection of H and D errors but a known weakness on K_A errors that we trace to the small voltage-recovery signature of the slow-AVR configuration used in this study. A repo-level PMU CSV schema is included to support replacement of the synthetic event generator by recorded PMU events when matched simulation and parameter-label metadata are available. We also add a real-PMU case study using the LBNL PMU Event Library, converting its voltage sag/swell records into the repository schema and using them to test field-data ingestion and event morphology. The pipeline demonstrates that an automated mismatch detector can support MOD-026-2 and MOD-033 compliance workflows while preserving engineering interpretability, and we discuss concrete next steps for field deployment on real PMU data without over-claiming MOD-026 parameter attribution from a real archive that lacks those labels.</w:t>
       </w:r>
     </w:p>
     <w:p>
@@ -292,6 +292,48 @@
     </w:p>
     <w:p>
       <w:pPr>
+        <w:jc w:val="both"/>
+      </w:pPr>
+      <w:r>
+        <w:rPr>
+          <w:rFonts w:ascii="Times New Roman" w:hAnsi="Times New Roman"/>
+          <w:b w:val="0"/>
+          <w:i w:val="0"/>
+          <w:sz w:val="24"/>
+        </w:rPr>
+        <w:t>The dynamic model can be written compactly as follows. For machine i, the rotor-angle and speed states satisfy d(delta_i)/dt = omega_i - omega_s and 2H d(omega_i)/dt = omega_s(P_m,i - P_e,i - D(omega_i - omega_s)/omega_s). The simplified exciter state is dE_fd,i/dt = (sat[K_A(V_ref - V_t,i)] - E_fd,i)/T_A, where sat[.] enforces the field-voltage ceiling. The electrical coupling is P_e,1 = P_max sin(delta_1 - delta_2), P_e,2 = -P_e,1, and the terminal-voltage proxy is V_t approximately equal to |E_prime - j Xd_prime I| with I approximately P_e/E_prime. These equations are intentionally low order: they preserve the inertia, damping, and excitation signatures needed for MOD-026/MOD-033 method validation while keeping the parameter labels auditable.</w:t>
+      </w:r>
+    </w:p>
+    <w:p>
+      <w:pPr>
+        <w:jc w:val="both"/>
+      </w:pPr>
+      <w:r>
+        <w:rPr>
+          <w:rFonts w:ascii="Times New Roman" w:hAnsi="Times New Roman"/>
+          <w:b w:val="0"/>
+          <w:i w:val="0"/>
+          <w:sz w:val="24"/>
+        </w:rPr>
+        <w:t>For each event k, the PMU trajectory is represented by y_k(t) = [V_k(t), f_k(t), delta_k(t), omega_pu,k(t)]. The feature map phi(.) splits each channel into four equal windows and stores mean, standard deviation, minimum, maximum, the log last-window/first-window amplitude ratio, and the first-to-last trend. The trajectory surrogate learns g_theta(phi(y_k), u_k) -&gt; V_k(t_event:t_event+1 s), where u_k denotes the event descriptor. The held-out trajectory error reported in Section 5 is RMSE = sqrt((1/N T) sum_k sum_t (V_hat_k,t - V_k,t)^2).</w:t>
+      </w:r>
+    </w:p>
+    <w:p>
+      <w:pPr>
+        <w:jc w:val="both"/>
+      </w:pPr>
+      <w:r>
+        <w:rPr>
+          <w:rFonts w:ascii="Times New Roman" w:hAnsi="Times New Roman"/>
+          <w:b w:val="0"/>
+          <w:i w:val="0"/>
+          <w:sz w:val="24"/>
+        </w:rPr>
+        <w:t>The novelty score is e_k = ||z_k - h_psi(z_k)||_2, where z_k is the standardized feature vector and h_psi(.) is the autoencoder trained only on correct-model events. The binary alarm is a_k = 1[e_k &gt; mu_0 + 3 sigma_0], where mu_0 and sigma_0 are computed from the correct-model validation subset. For attribution, features are centered by the correct-model centroid c_0 and the sensitivity head computes s_c(k) = w_c^T(phi_k - c_0) + b_c. The predicted parameter class is argmax_c s_c(k), but only when a_k = 1; otherwise the event is reported as correct/no actionable mismatch.</w:t>
+      </w:r>
+    </w:p>
+    <w:p>
+      <w:pPr>
         <w:pStyle w:val="Heading2"/>
       </w:pPr>
       <w:r>
@@ -1009,19 +1051,7 @@
                 <w:rFonts w:ascii="Consolas" w:hAnsi="Consolas" w:eastAsia="Consolas" w:cs="Consolas"/>
                 <w:sz w:val="18"/>
               </w:rPr>
-              <w:t xml:space="preserve">        C=1.0, multi_class="multinomial",</w:t>
-            </w:r>
-          </w:p>
-          <w:p>
-            <w:pPr>
-              <w:jc w:val="left"/>
-            </w:pPr>
-            <w:r>
-              <w:rPr>
-                <w:rFonts w:ascii="Consolas" w:hAnsi="Consolas" w:eastAsia="Consolas" w:cs="Consolas"/>
-                <w:sz w:val="18"/>
-              </w:rPr>
-              <w:t xml:space="preserve">        solver="lbfgs", random_state=RNG_SEED,</w:t>
+              <w:t xml:space="preserve">        C=1.0, solver="lbfgs", random_state=RNG_SEED,</w:t>
             </w:r>
           </w:p>
           <w:p>
@@ -1998,6 +2028,341 @@
           <w:sz w:val="24"/>
         </w:rPr>
         <w:t>All numerical integration is performed with scipy.integrate.solve_ivp using the RK45 method with relative tolerance 1e-6 and absolute tolerance 1e-8, and a maximum step size of 0.01 s. The synthetic PMU is assumed to sample at 60 samples/s, which is at the lower end of the 30-60 samples/s range specified for disturbance-recording PMUs; we have verified that the qualitative results are unchanged at 120 samples/s. The trajectory surrogate is trained on a 1-s post-event voltage trajectory downsampled to 60 points, which matches the window used by the autoencoder for feature extraction. All experiments are run on a single CPU core in a sandboxed Linux environment with Python 3.12.14, scikit-learn 1.5.2, scipy 1.14.1, and matplotlib 3.9.2. The total wall-clock time for one complete run of paper3_cnnlstm_model_validation.py is approximately 90 s, which is consistent with the lightweight MLPRegressor-based implementation.</w:t>
+      </w:r>
+    </w:p>
+    <w:p>
+      <w:pPr>
+        <w:pStyle w:val="Heading2"/>
+      </w:pPr>
+      <w:r>
+        <w:t>4.1 Data sources and validation roles</w:t>
+      </w:r>
+    </w:p>
+    <w:p>
+      <w:pPr>
+        <w:jc w:val="center"/>
+      </w:pPr>
+      <w:r>
+        <w:rPr>
+          <w:rFonts w:ascii="Times New Roman" w:hAnsi="Times New Roman"/>
+          <w:b/>
+          <w:i/>
+          <w:sz w:val="20"/>
+        </w:rPr>
+        <w:t>Table 2. Data sources and their role in the IEEE-style validation workflow.</w:t>
+      </w:r>
+    </w:p>
+    <w:tbl>
+      <w:tblPr>
+        <w:tblStyle w:val="TableGrid"/>
+        <w:tblW w:type="auto" w:w="0"/>
+        <w:tblLook w:firstColumn="1" w:firstRow="1" w:lastColumn="0" w:lastRow="0" w:noHBand="0" w:noVBand="1" w:val="04A0"/>
+      </w:tblPr>
+      <w:tblGrid>
+        <w:gridCol w:w="1872"/>
+        <w:gridCol w:w="1872"/>
+        <w:gridCol w:w="1872"/>
+        <w:gridCol w:w="1872"/>
+        <w:gridCol w:w="1872"/>
+      </w:tblGrid>
+      <w:tr>
+        <w:tc>
+          <w:tcPr>
+            <w:tcW w:type="dxa" w:w="2160"/>
+            <w:shd w:val="clear" w:color="auto" w:fill="D9D9D9"/>
+          </w:tcPr>
+          <w:p>
+            <w:pPr>
+              <w:jc w:val="center"/>
+            </w:pPr>
+            <w:r>
+              <w:rPr>
+                <w:rFonts w:ascii="Times New Roman" w:hAnsi="Times New Roman"/>
+                <w:b/>
+                <w:sz w:val="20"/>
+              </w:rPr>
+              <w:t>Dataset</w:t>
+            </w:r>
+          </w:p>
+        </w:tc>
+        <w:tc>
+          <w:tcPr>
+            <w:tcW w:type="dxa" w:w="1584"/>
+            <w:shd w:val="clear" w:color="auto" w:fill="D9D9D9"/>
+          </w:tcPr>
+          <w:p>
+            <w:pPr>
+              <w:jc w:val="center"/>
+            </w:pPr>
+            <w:r>
+              <w:rPr>
+                <w:rFonts w:ascii="Times New Roman" w:hAnsi="Times New Roman"/>
+                <w:b/>
+                <w:sz w:val="20"/>
+              </w:rPr>
+              <w:t>Scale</w:t>
+            </w:r>
+          </w:p>
+        </w:tc>
+        <w:tc>
+          <w:tcPr>
+            <w:tcW w:type="dxa" w:w="2016"/>
+            <w:shd w:val="clear" w:color="auto" w:fill="D9D9D9"/>
+          </w:tcPr>
+          <w:p>
+            <w:pPr>
+              <w:jc w:val="center"/>
+            </w:pPr>
+            <w:r>
+              <w:rPr>
+                <w:rFonts w:ascii="Times New Roman" w:hAnsi="Times New Roman"/>
+                <w:b/>
+                <w:sz w:val="20"/>
+              </w:rPr>
+              <w:t>Events</w:t>
+            </w:r>
+          </w:p>
+        </w:tc>
+        <w:tc>
+          <w:tcPr>
+            <w:tcW w:type="dxa" w:w="2160"/>
+            <w:shd w:val="clear" w:color="auto" w:fill="D9D9D9"/>
+          </w:tcPr>
+          <w:p>
+            <w:pPr>
+              <w:jc w:val="center"/>
+            </w:pPr>
+            <w:r>
+              <w:rPr>
+                <w:rFonts w:ascii="Times New Roman" w:hAnsi="Times New Roman"/>
+                <w:b/>
+                <w:sz w:val="20"/>
+              </w:rPr>
+              <w:t>Labels</w:t>
+            </w:r>
+          </w:p>
+        </w:tc>
+        <w:tc>
+          <w:tcPr>
+            <w:tcW w:type="dxa" w:w="2592"/>
+            <w:shd w:val="clear" w:color="auto" w:fill="D9D9D9"/>
+          </w:tcPr>
+          <w:p>
+            <w:pPr>
+              <w:jc w:val="center"/>
+            </w:pPr>
+            <w:r>
+              <w:rPr>
+                <w:rFonts w:ascii="Times New Roman" w:hAnsi="Times New Roman"/>
+                <w:b/>
+                <w:sz w:val="20"/>
+              </w:rPr>
+              <w:t>Role in paper</w:t>
+            </w:r>
+          </w:p>
+        </w:tc>
+      </w:tr>
+      <w:tr>
+        <w:tc>
+          <w:tcPr>
+            <w:tcW w:type="dxa" w:w="2160"/>
+          </w:tcPr>
+          <w:p>
+            <w:pPr>
+              <w:jc w:val="center"/>
+            </w:pPr>
+            <w:r>
+              <w:rPr>
+                <w:rFonts w:ascii="Times New Roman" w:hAnsi="Times New Roman"/>
+                <w:sz w:val="20"/>
+              </w:rPr>
+              <w:t>Synthetic two-machine PMU benchmark</w:t>
+            </w:r>
+          </w:p>
+        </w:tc>
+        <w:tc>
+          <w:tcPr>
+            <w:tcW w:type="dxa" w:w="1584"/>
+          </w:tcPr>
+          <w:p>
+            <w:pPr>
+              <w:jc w:val="center"/>
+            </w:pPr>
+            <w:r>
+              <w:rPr>
+                <w:rFonts w:ascii="Times New Roman" w:hAnsi="Times New Roman"/>
+                <w:sz w:val="20"/>
+              </w:rPr>
+              <w:t>880 events</w:t>
+            </w:r>
+          </w:p>
+        </w:tc>
+        <w:tc>
+          <w:tcPr>
+            <w:tcW w:type="dxa" w:w="2016"/>
+          </w:tcPr>
+          <w:p>
+            <w:pPr>
+              <w:jc w:val="center"/>
+            </w:pPr>
+            <w:r>
+              <w:rPr>
+                <w:rFonts w:ascii="Times New Roman" w:hAnsi="Times New Roman"/>
+                <w:sz w:val="20"/>
+              </w:rPr>
+              <w:t>Line trip, generator trip, three-phase fault</w:t>
+            </w:r>
+          </w:p>
+        </w:tc>
+        <w:tc>
+          <w:tcPr>
+            <w:tcW w:type="dxa" w:w="2160"/>
+          </w:tcPr>
+          <w:p>
+            <w:pPr>
+              <w:jc w:val="center"/>
+            </w:pPr>
+            <w:r>
+              <w:rPr>
+                <w:rFonts w:ascii="Times New Roman" w:hAnsi="Times New Roman"/>
+                <w:sz w:val="20"/>
+              </w:rPr>
+              <w:t>Known H/D/K_A labels</w:t>
+            </w:r>
+          </w:p>
+        </w:tc>
+        <w:tc>
+          <w:tcPr>
+            <w:tcW w:type="dxa" w:w="2592"/>
+          </w:tcPr>
+          <w:p>
+            <w:pPr>
+              <w:jc w:val="center"/>
+            </w:pPr>
+            <w:r>
+              <w:rPr>
+                <w:rFonts w:ascii="Times New Roman" w:hAnsi="Times New Roman"/>
+                <w:sz w:val="20"/>
+              </w:rPr>
+              <w:t>Supervised MOD-026/MOD-033 attribution benchmark</w:t>
+            </w:r>
+          </w:p>
+        </w:tc>
+      </w:tr>
+      <w:tr>
+        <w:tc>
+          <w:tcPr>
+            <w:tcW w:type="dxa" w:w="2160"/>
+          </w:tcPr>
+          <w:p>
+            <w:pPr>
+              <w:jc w:val="center"/>
+            </w:pPr>
+            <w:r>
+              <w:rPr>
+                <w:rFonts w:ascii="Times New Roman" w:hAnsi="Times New Roman"/>
+                <w:sz w:val="20"/>
+              </w:rPr>
+              <w:t>LBNL PMU Event Library</w:t>
+            </w:r>
+          </w:p>
+        </w:tc>
+        <w:tc>
+          <w:tcPr>
+            <w:tcW w:type="dxa" w:w="1584"/>
+          </w:tcPr>
+          <w:p>
+            <w:pPr>
+              <w:jc w:val="center"/>
+            </w:pPr>
+            <w:r>
+              <w:rPr>
+                <w:rFonts w:ascii="Times New Roman" w:hAnsi="Times New Roman"/>
+                <w:sz w:val="20"/>
+              </w:rPr>
+              <w:t>30 events / 65 PMU-event pairs</w:t>
+            </w:r>
+          </w:p>
+        </w:tc>
+        <w:tc>
+          <w:tcPr>
+            <w:tcW w:type="dxa" w:w="2016"/>
+          </w:tcPr>
+          <w:p>
+            <w:pPr>
+              <w:jc w:val="center"/>
+            </w:pPr>
+            <w:r>
+              <w:rPr>
+                <w:rFonts w:ascii="Times New Roman" w:hAnsi="Times New Roman"/>
+                <w:sz w:val="20"/>
+              </w:rPr>
+              <w:t>Real distribution-PMU voltage events</w:t>
+            </w:r>
+          </w:p>
+        </w:tc>
+        <w:tc>
+          <w:tcPr>
+            <w:tcW w:type="dxa" w:w="2160"/>
+          </w:tcPr>
+          <w:p>
+            <w:pPr>
+              <w:jc w:val="center"/>
+            </w:pPr>
+            <w:r>
+              <w:rPr>
+                <w:rFonts w:ascii="Times New Roman" w:hAnsi="Times New Roman"/>
+                <w:sz w:val="20"/>
+              </w:rPr>
+              <w:t>Sag/swell morphology; no MOD-026 parameter labels</w:t>
+            </w:r>
+          </w:p>
+        </w:tc>
+        <w:tc>
+          <w:tcPr>
+            <w:tcW w:type="dxa" w:w="2592"/>
+          </w:tcPr>
+          <w:p>
+            <w:pPr>
+              <w:jc w:val="center"/>
+            </w:pPr>
+            <w:r>
+              <w:rPr>
+                <w:rFonts w:ascii="Times New Roman" w:hAnsi="Times New Roman"/>
+                <w:sz w:val="20"/>
+              </w:rPr>
+              <w:t>Real-PMU ingestion and morphology check</w:t>
+            </w:r>
+          </w:p>
+        </w:tc>
+      </w:tr>
+    </w:tbl>
+    <w:p>
+      <w:pPr>
+        <w:jc w:val="both"/>
+      </w:pPr>
+      <w:r>
+        <w:rPr>
+          <w:rFonts w:ascii="Times New Roman" w:hAnsi="Times New Roman"/>
+          <w:b w:val="0"/>
+          <w:i w:val="0"/>
+          <w:sz w:val="24"/>
+        </w:rPr>
+        <w:t>The LBNL PMU Event Library is used in this revision as a real-data ingestion and morphology test. It contains real distribution-PMU event captures from the Lawrence Berkeley National Laboratory campus, with raw voltage/current phasor CSV files and event-parameter CSV files. The archive is highly relevant for PMU preprocessing because it contains realistic measurement artifacts, event-to-event duration variation, and voltage-sag dynamics. However, it is not a direct MOD-026-2 supervised benchmark: it does not provide a matched dynamic simulation for each event, nor verified H, D, or K_A parameter-error labels. For that reason, this paper uses LBNL data for real-PMU schema conversion and event-shape validation, while the synthetic benchmark remains the source of auditable parameter-attribution labels.</w:t>
+      </w:r>
+    </w:p>
+    <w:p>
+      <w:pPr>
+        <w:jc w:val="both"/>
+      </w:pPr>
+      <w:r>
+        <w:rPr>
+          <w:rFonts w:ascii="Times New Roman" w:hAnsi="Times New Roman"/>
+          <w:b w:val="0"/>
+          <w:i w:val="0"/>
+          <w:sz w:val="24"/>
+        </w:rPr>
+        <w:t>The converter paper3_lbnl_real_pmu_summary.py normalizes the LBNL raw CSV hierarchy into the Paper 3 schema. In the inspected archive, it identified 30 events, 65 PMU-event pairs, and 3 PMU locations. Voltage sag morphology is present in 57 PMU-event pairs. The normalized voltage range is 0.296-1.016 pu after per-event baseline normalization. Frequency is marked unavailable because the inspected LBNL raw CSVs provide voltage/current phasors but not a frequency channel.</w:t>
       </w:r>
     </w:p>
     <w:p>
@@ -2175,7 +2540,7 @@
           <w:i w:val="0"/>
           <w:sz w:val="24"/>
         </w:rPr>
-        <w:t>Table 2 reports the per-class detection metrics (precision, recall, F1, and support) for the four-class prediction problem that results from combining the autoencoder's binary novelty decision with the sensitivity classifier's parameter-error attribution. H and D errors are detected with perfect precision and recall, while the K_A error class collapses almost entirely into the correct-model class. We attribute this collapse to the slow-AVR configuration used in this study: with T_A = 0.50 s, the voltage recovery signature of a ±30% K_A error is small relative to the inter-area oscillation signature, and the autoencoder cannot reliably separate it from the in-distribution baseline. We discuss this limitation in detail in Section 6 and propose a faster-AVR re-test as part of the future-work agenda.</w:t>
+        <w:t>Table 3 reports the per-class detection metrics (precision, recall, F1, and support) for the four-class prediction problem that results from combining the autoencoder's binary novelty decision with the sensitivity classifier's parameter-error attribution. H and D errors are detected with perfect precision and recall, while the K_A error class collapses almost entirely into the correct-model class. We attribute this collapse to the slow-AVR configuration used in this study: with T_A = 0.50 s, the voltage recovery signature of a ±30% K_A error is small relative to the inter-area oscillation signature, and the autoencoder cannot reliably separate it from the in-distribution baseline. We discuss this limitation in detail in Section 6 and propose a faster-AVR re-test as part of the future-work agenda.</w:t>
       </w:r>
     </w:p>
     <w:p>
@@ -2189,7 +2554,7 @@
           <w:i/>
           <w:sz w:val="20"/>
         </w:rPr>
-        <w:t>Table 2. Per-class detection metrics on the held-out test set (precision, recall, F1, support).</w:t>
+        <w:t>Table 3. Per-class detection metrics on the held-out test set (precision, recall, F1, support).</w:t>
       </w:r>
     </w:p>
     <w:tbl>
@@ -2736,7 +3101,7 @@
           <w:i w:val="0"/>
           <w:sz w:val="24"/>
         </w:rPr>
-        <w:t>Table 3 summarises the attribution accuracy by true parameter-error class. The overall attribution accuracy is 0.674, computed over the wrong-model cases only. H and D errors are attributed with 100% accuracy, while K_A errors are attributed with only 0.021 accuracy. We emphasise that this is not a failure of the attribution classifier itself: if the autoencoder had flagged the K_A-error events correctly, the sensitivity classifier would have attributed them correctly. The failure is upstream, in the novelty detector, and is a direct consequence of the small K_A-error signature under the slow-AVR configuration used here. This separation between detection and attribution is one of the engineering benefits of the two-stage pipeline: it localises the diagnosis to a specific component and avoids a black-box 'the model is wrong' verdict.</w:t>
+        <w:t>Table 4 summarises the attribution accuracy by true parameter-error class. The overall attribution accuracy is 0.674, computed over the wrong-model cases only. H and D errors are attributed with 100% accuracy, while K_A errors are attributed with only 0.021 accuracy. We emphasise that this is not a failure of the attribution classifier itself: if the autoencoder had flagged the K_A-error events correctly, the sensitivity classifier would have attributed them correctly. The failure is upstream, in the novelty detector, and is a direct consequence of the small K_A-error signature under the slow-AVR configuration used here. This separation between detection and attribution is one of the engineering benefits of the two-stage pipeline: it localises the diagnosis to a specific component and avoids a black-box 'the model is wrong' verdict.</w:t>
       </w:r>
     </w:p>
     <w:p>
@@ -2750,7 +3115,7 @@
           <w:i/>
           <w:sz w:val="20"/>
         </w:rPr>
-        <w:t>Table 3. Attribution accuracy by parameter-error class. Overall is computed over all wrong-model cases.</w:t>
+        <w:t>Table 4. Attribution accuracy by parameter-error class. Overall is computed over all wrong-model cases.</w:t>
       </w:r>
     </w:p>
     <w:tbl>
@@ -3011,9 +3376,472 @@
           <w:i w:val="0"/>
           <w:sz w:val="24"/>
         </w:rPr>
-        <w:t>Figure 4 visualises the mean sensitivity-score heatmap produced by the multinomial logistic-regression attribution head. Each row corresponds to a true parameter-error class, and each column corresponds to a candidate predicted class. The colour scale is per-row normalised to highlight the relative magnitude of the attribution scores, while the raw decision-function values are shown as text in each cell. The diagonal structure of the heatmap (bright cells on the diagonal for H and D rows) confirms that the sensitivity classifier has learned the correct direction in feature space for those two parameter errors. The K_A row, in contrast, shows low sensitivity scores across all candidate classes, which is consistent with the failure mode documented in Table 3 and Figure 3.</w:t>
+        <w:t>Figure 4 visualises the mean sensitivity-score heatmap produced by the multinomial logistic-regression attribution head. Each row corresponds to a true parameter-error class, and each column corresponds to a candidate predicted class. The colour scale is per-row normalised to highlight the relative magnitude of the attribution scores, while the raw decision-function values are shown as text in each cell. The diagonal structure of the heatmap (bright cells on the diagonal for H and D rows) confirms that the sensitivity classifier has learned the correct direction in feature space for those two parameter errors. The K_A row, in contrast, shows low sensitivity scores across all candidate classes, which is consistent with the failure mode documented in Table 4 and Figure 3.</w:t>
       </w:r>
     </w:p>
+    <w:p>
+      <w:pPr>
+        <w:pStyle w:val="Heading2"/>
+      </w:pPr>
+      <w:r>
+        <w:t>5.5 Real PMU ingestion case study: LBNL Event Library</w:t>
+      </w:r>
+    </w:p>
+    <w:p>
+      <w:pPr>
+        <w:jc w:val="both"/>
+      </w:pPr>
+      <w:r>
+        <w:rPr>
+          <w:rFonts w:ascii="Times New Roman" w:hAnsi="Times New Roman"/>
+          <w:b w:val="0"/>
+          <w:i w:val="0"/>
+          <w:sz w:val="24"/>
+        </w:rPr>
+        <w:t>Figure 5 reports the real-PMU ingestion case study based on the LBNL PMU Event Library. The left panel shows the most severe normalized voltage sag identified by the converter; the right panel summarizes the distribution of minimum voltage across all converted PMU-event pairs. This figure is intentionally separated from the supervised MOD-026 parameter-attribution results because the LBNL archive does not contain verified H, D, or K_A error labels. Its purpose is to demonstrate that the repo-level schema and loader can ingest real PMU events with realistic event lengths, missing channels, and non-Gaussian voltage excursions.</w:t>
+      </w:r>
+    </w:p>
+    <w:p>
+      <w:pPr>
+        <w:jc w:val="center"/>
+      </w:pPr>
+      <w:r>
+        <w:drawing>
+          <wp:inline xmlns:a="http://schemas.openxmlformats.org/drawingml/2006/main" xmlns:pic="http://schemas.openxmlformats.org/drawingml/2006/picture">
+            <wp:extent cx="5669280" cy="2132481"/>
+            <wp:docPr id="5" name="Picture 5"/>
+            <wp:cNvGraphicFramePr>
+              <a:graphicFrameLocks noChangeAspect="1"/>
+            </wp:cNvGraphicFramePr>
+            <a:graphic>
+              <a:graphicData uri="http://schemas.openxmlformats.org/drawingml/2006/picture">
+                <pic:pic>
+                  <pic:nvPicPr>
+                    <pic:cNvPr id="0" name="paper3_fig5_lbnl_real_pmu_summary.png"/>
+                    <pic:cNvPicPr/>
+                  </pic:nvPicPr>
+                  <pic:blipFill>
+                    <a:blip r:embed="rId13"/>
+                    <a:stretch>
+                      <a:fillRect/>
+                    </a:stretch>
+                  </pic:blipFill>
+                  <pic:spPr>
+                    <a:xfrm>
+                      <a:off x="0" y="0"/>
+                      <a:ext cx="5669280" cy="2132481"/>
+                    </a:xfrm>
+                    <a:prstGeom prst="rect"/>
+                  </pic:spPr>
+                </pic:pic>
+              </a:graphicData>
+            </a:graphic>
+          </wp:inline>
+        </w:drawing>
+      </w:r>
+    </w:p>
+    <w:p>
+      <w:pPr>
+        <w:jc w:val="center"/>
+      </w:pPr>
+      <w:r>
+        <w:rPr>
+          <w:rFonts w:ascii="Times New Roman" w:hAnsi="Times New Roman"/>
+          <w:i/>
+          <w:sz w:val="20"/>
+        </w:rPr>
+        <w:t>Figure 5. Real PMU ingestion case study using the LBNL PMU Event Library. Left: normalized voltage trajectory for the most severe sag PMU-event pair. Right: distribution of minimum normalized voltage across converted PMU-event pairs.</w:t>
+      </w:r>
+    </w:p>
+    <w:p>
+      <w:pPr>
+        <w:jc w:val="center"/>
+      </w:pPr>
+      <w:r>
+        <w:rPr>
+          <w:rFonts w:ascii="Times New Roman" w:hAnsi="Times New Roman"/>
+          <w:b/>
+          <w:i/>
+          <w:sz w:val="20"/>
+        </w:rPr>
+        <w:t>Table 5. Real-PMU summary generated from the LBNL PMU Event Library converter.</w:t>
+      </w:r>
+    </w:p>
+    <w:tbl>
+      <w:tblPr>
+        <w:tblStyle w:val="TableGrid"/>
+        <w:tblW w:type="auto" w:w="0"/>
+        <w:tblLook w:firstColumn="1" w:firstRow="1" w:lastColumn="0" w:lastRow="0" w:noHBand="0" w:noVBand="1" w:val="04A0"/>
+      </w:tblPr>
+      <w:tblGrid>
+        <w:gridCol w:w="4680"/>
+        <w:gridCol w:w="4680"/>
+      </w:tblGrid>
+      <w:tr>
+        <w:tc>
+          <w:tcPr>
+            <w:tcW w:type="dxa" w:w="3456"/>
+            <w:shd w:val="clear" w:color="auto" w:fill="D9D9D9"/>
+          </w:tcPr>
+          <w:p>
+            <w:pPr>
+              <w:jc w:val="center"/>
+            </w:pPr>
+            <w:r>
+              <w:rPr>
+                <w:rFonts w:ascii="Times New Roman" w:hAnsi="Times New Roman"/>
+                <w:b/>
+                <w:sz w:val="20"/>
+              </w:rPr>
+              <w:t>Attribute</w:t>
+            </w:r>
+          </w:p>
+        </w:tc>
+        <w:tc>
+          <w:tcPr>
+            <w:tcW w:type="dxa" w:w="5328"/>
+            <w:shd w:val="clear" w:color="auto" w:fill="D9D9D9"/>
+          </w:tcPr>
+          <w:p>
+            <w:pPr>
+              <w:jc w:val="center"/>
+            </w:pPr>
+            <w:r>
+              <w:rPr>
+                <w:rFonts w:ascii="Times New Roman" w:hAnsi="Times New Roman"/>
+                <w:b/>
+                <w:sz w:val="20"/>
+              </w:rPr>
+              <w:t>Value</w:t>
+            </w:r>
+          </w:p>
+        </w:tc>
+      </w:tr>
+      <w:tr>
+        <w:tc>
+          <w:tcPr>
+            <w:tcW w:type="dxa" w:w="3456"/>
+          </w:tcPr>
+          <w:p>
+            <w:pPr>
+              <w:jc w:val="center"/>
+            </w:pPr>
+            <w:r>
+              <w:rPr>
+                <w:rFonts w:ascii="Times New Roman" w:hAnsi="Times New Roman"/>
+                <w:sz w:val="20"/>
+              </w:rPr>
+              <w:t>Source</w:t>
+            </w:r>
+          </w:p>
+        </w:tc>
+        <w:tc>
+          <w:tcPr>
+            <w:tcW w:type="dxa" w:w="5328"/>
+          </w:tcPr>
+          <w:p>
+            <w:pPr>
+              <w:jc w:val="center"/>
+            </w:pPr>
+            <w:r>
+              <w:rPr>
+                <w:rFonts w:ascii="Times New Roman" w:hAnsi="Times New Roman"/>
+                <w:sz w:val="20"/>
+              </w:rPr>
+              <w:t>LBNL PMU Event Library</w:t>
+            </w:r>
+          </w:p>
+        </w:tc>
+      </w:tr>
+      <w:tr>
+        <w:tc>
+          <w:tcPr>
+            <w:tcW w:type="dxa" w:w="3456"/>
+          </w:tcPr>
+          <w:p>
+            <w:pPr>
+              <w:jc w:val="center"/>
+            </w:pPr>
+            <w:r>
+              <w:rPr>
+                <w:rFonts w:ascii="Times New Roman" w:hAnsi="Times New Roman"/>
+                <w:sz w:val="20"/>
+              </w:rPr>
+              <w:t>Events</w:t>
+            </w:r>
+          </w:p>
+        </w:tc>
+        <w:tc>
+          <w:tcPr>
+            <w:tcW w:type="dxa" w:w="5328"/>
+          </w:tcPr>
+          <w:p>
+            <w:pPr>
+              <w:jc w:val="center"/>
+            </w:pPr>
+            <w:r>
+              <w:rPr>
+                <w:rFonts w:ascii="Times New Roman" w:hAnsi="Times New Roman"/>
+                <w:sz w:val="20"/>
+              </w:rPr>
+              <w:t>30</w:t>
+            </w:r>
+          </w:p>
+        </w:tc>
+      </w:tr>
+      <w:tr>
+        <w:tc>
+          <w:tcPr>
+            <w:tcW w:type="dxa" w:w="3456"/>
+          </w:tcPr>
+          <w:p>
+            <w:pPr>
+              <w:jc w:val="center"/>
+            </w:pPr>
+            <w:r>
+              <w:rPr>
+                <w:rFonts w:ascii="Times New Roman" w:hAnsi="Times New Roman"/>
+                <w:sz w:val="20"/>
+              </w:rPr>
+              <w:t>PMU-event pairs</w:t>
+            </w:r>
+          </w:p>
+        </w:tc>
+        <w:tc>
+          <w:tcPr>
+            <w:tcW w:type="dxa" w:w="5328"/>
+          </w:tcPr>
+          <w:p>
+            <w:pPr>
+              <w:jc w:val="center"/>
+            </w:pPr>
+            <w:r>
+              <w:rPr>
+                <w:rFonts w:ascii="Times New Roman" w:hAnsi="Times New Roman"/>
+                <w:sz w:val="20"/>
+              </w:rPr>
+              <w:t>65</w:t>
+            </w:r>
+          </w:p>
+        </w:tc>
+      </w:tr>
+      <w:tr>
+        <w:tc>
+          <w:tcPr>
+            <w:tcW w:type="dxa" w:w="3456"/>
+          </w:tcPr>
+          <w:p>
+            <w:pPr>
+              <w:jc w:val="center"/>
+            </w:pPr>
+            <w:r>
+              <w:rPr>
+                <w:rFonts w:ascii="Times New Roman" w:hAnsi="Times New Roman"/>
+                <w:sz w:val="20"/>
+              </w:rPr>
+              <w:t>PMU locations</w:t>
+            </w:r>
+          </w:p>
+        </w:tc>
+        <w:tc>
+          <w:tcPr>
+            <w:tcW w:type="dxa" w:w="5328"/>
+          </w:tcPr>
+          <w:p>
+            <w:pPr>
+              <w:jc w:val="center"/>
+            </w:pPr>
+            <w:r>
+              <w:rPr>
+                <w:rFonts w:ascii="Times New Roman" w:hAnsi="Times New Roman"/>
+                <w:sz w:val="20"/>
+              </w:rPr>
+              <w:t>3</w:t>
+            </w:r>
+          </w:p>
+        </w:tc>
+      </w:tr>
+      <w:tr>
+        <w:tc>
+          <w:tcPr>
+            <w:tcW w:type="dxa" w:w="3456"/>
+          </w:tcPr>
+          <w:p>
+            <w:pPr>
+              <w:jc w:val="center"/>
+            </w:pPr>
+            <w:r>
+              <w:rPr>
+                <w:rFonts w:ascii="Times New Roman" w:hAnsi="Times New Roman"/>
+                <w:sz w:val="20"/>
+              </w:rPr>
+              <w:t>Voltage sag pairs</w:t>
+            </w:r>
+          </w:p>
+        </w:tc>
+        <w:tc>
+          <w:tcPr>
+            <w:tcW w:type="dxa" w:w="5328"/>
+          </w:tcPr>
+          <w:p>
+            <w:pPr>
+              <w:jc w:val="center"/>
+            </w:pPr>
+            <w:r>
+              <w:rPr>
+                <w:rFonts w:ascii="Times New Roman" w:hAnsi="Times New Roman"/>
+                <w:sz w:val="20"/>
+              </w:rPr>
+              <w:t>57</w:t>
+            </w:r>
+          </w:p>
+        </w:tc>
+      </w:tr>
+      <w:tr>
+        <w:tc>
+          <w:tcPr>
+            <w:tcW w:type="dxa" w:w="3456"/>
+          </w:tcPr>
+          <w:p>
+            <w:pPr>
+              <w:jc w:val="center"/>
+            </w:pPr>
+            <w:r>
+              <w:rPr>
+                <w:rFonts w:ascii="Times New Roman" w:hAnsi="Times New Roman"/>
+                <w:sz w:val="20"/>
+              </w:rPr>
+              <w:t>Samples per PMU-event</w:t>
+            </w:r>
+          </w:p>
+        </w:tc>
+        <w:tc>
+          <w:tcPr>
+            <w:tcW w:type="dxa" w:w="5328"/>
+          </w:tcPr>
+          <w:p>
+            <w:pPr>
+              <w:jc w:val="center"/>
+            </w:pPr>
+            <w:r>
+              <w:rPr>
+                <w:rFonts w:ascii="Times New Roman" w:hAnsi="Times New Roman"/>
+                <w:sz w:val="20"/>
+              </w:rPr>
+              <w:t>131-200</w:t>
+            </w:r>
+          </w:p>
+        </w:tc>
+      </w:tr>
+      <w:tr>
+        <w:tc>
+          <w:tcPr>
+            <w:tcW w:type="dxa" w:w="3456"/>
+          </w:tcPr>
+          <w:p>
+            <w:pPr>
+              <w:jc w:val="center"/>
+            </w:pPr>
+            <w:r>
+              <w:rPr>
+                <w:rFonts w:ascii="Times New Roman" w:hAnsi="Times New Roman"/>
+                <w:sz w:val="20"/>
+              </w:rPr>
+              <w:t>Normalized voltage range</w:t>
+            </w:r>
+          </w:p>
+        </w:tc>
+        <w:tc>
+          <w:tcPr>
+            <w:tcW w:type="dxa" w:w="5328"/>
+          </w:tcPr>
+          <w:p>
+            <w:pPr>
+              <w:jc w:val="center"/>
+            </w:pPr>
+            <w:r>
+              <w:rPr>
+                <w:rFonts w:ascii="Times New Roman" w:hAnsi="Times New Roman"/>
+                <w:sz w:val="20"/>
+              </w:rPr>
+              <w:t>0.296-1.016 pu</w:t>
+            </w:r>
+          </w:p>
+        </w:tc>
+      </w:tr>
+      <w:tr>
+        <w:tc>
+          <w:tcPr>
+            <w:tcW w:type="dxa" w:w="3456"/>
+          </w:tcPr>
+          <w:p>
+            <w:pPr>
+              <w:jc w:val="center"/>
+            </w:pPr>
+            <w:r>
+              <w:rPr>
+                <w:rFonts w:ascii="Times New Roman" w:hAnsi="Times New Roman"/>
+                <w:sz w:val="20"/>
+              </w:rPr>
+              <w:t>Frequency channel</w:t>
+            </w:r>
+          </w:p>
+        </w:tc>
+        <w:tc>
+          <w:tcPr>
+            <w:tcW w:type="dxa" w:w="5328"/>
+          </w:tcPr>
+          <w:p>
+            <w:pPr>
+              <w:jc w:val="center"/>
+            </w:pPr>
+            <w:r>
+              <w:rPr>
+                <w:rFonts w:ascii="Times New Roman" w:hAnsi="Times New Roman"/>
+                <w:sz w:val="20"/>
+              </w:rPr>
+              <w:t>Not available in inspected raw CSVs</w:t>
+            </w:r>
+          </w:p>
+        </w:tc>
+      </w:tr>
+      <w:tr>
+        <w:tc>
+          <w:tcPr>
+            <w:tcW w:type="dxa" w:w="3456"/>
+          </w:tcPr>
+          <w:p>
+            <w:pPr>
+              <w:jc w:val="center"/>
+            </w:pPr>
+            <w:r>
+              <w:rPr>
+                <w:rFonts w:ascii="Times New Roman" w:hAnsi="Times New Roman"/>
+                <w:sz w:val="20"/>
+              </w:rPr>
+              <w:t>MOD-026 parameter labels</w:t>
+            </w:r>
+          </w:p>
+        </w:tc>
+        <w:tc>
+          <w:tcPr>
+            <w:tcW w:type="dxa" w:w="5328"/>
+          </w:tcPr>
+          <w:p>
+            <w:pPr>
+              <w:jc w:val="center"/>
+            </w:pPr>
+            <w:r>
+              <w:rPr>
+                <w:rFonts w:ascii="Times New Roman" w:hAnsi="Times New Roman"/>
+                <w:sz w:val="20"/>
+              </w:rPr>
+              <w:t>Not available</w:t>
+            </w:r>
+          </w:p>
+        </w:tc>
+      </w:tr>
+    </w:tbl>
     <w:p>
       <w:pPr>
         <w:pStyle w:val="Heading1"/>
@@ -3291,6 +4119,19 @@
           <w:rFonts w:ascii="Times New Roman" w:hAnsi="Times New Roman"/>
           <w:sz w:val="22"/>
         </w:rPr>
+        <w:t>Swenson, T., Vrettos, E., Mueller, J., &amp; Gehbauer, C. (2019). Open PMU Event Dataset: Detection and Characterization at LBNL Campus. IEEE PES General Meeting.</w:t>
+      </w:r>
+    </w:p>
+    <w:p>
+      <w:pPr>
+        <w:ind w:left="720" w:hanging="720"/>
+        <w:jc w:val="both"/>
+      </w:pPr>
+      <w:r>
+        <w:rPr>
+          <w:rFonts w:ascii="Times New Roman" w:hAnsi="Times New Roman"/>
+          <w:sz w:val="22"/>
+        </w:rPr>
         <w:t>Wang, S., Liu, Y., &amp; Liu, W. (2020). CNN-LSTM for power system trajectory prediction after large disturbances. IEEE Transactions on Power Systems, 35(2), 1345-1355.</w:t>
       </w:r>
     </w:p>
@@ -3365,7 +4206,7 @@
           <w:i w:val="0"/>
           <w:sz w:val="24"/>
         </w:rPr>
-        <w:t>The full pipeline is released as two open-source Python scripts. paper3_cnnlstm_model_validation.py generates the synthetic PMU event dataset, trains the trajectory surrogate, the autoencoder, and the sensitivity classifier, and writes all figures, CSV summaries, and the JSON summary used in this paper. paper3_assemble_docx.py (this script) builds the Word document from those artifacts. Both scripts are deterministic (the random seed is fixed at 20260908) and run in a sandboxed Linux environment with Python 3.12.14, scikit-learn 1.5.2, scipy 1.14.1, pandas 2.2.3, matplotlib 3.9.2, and python-docx 1.2.0. PyTorch is not required.</w:t>
+        <w:t>The full pipeline is released as two open-source Python scripts. paper3_cnnlstm_model_validation.py generates the synthetic PMU event dataset, trains the trajectory surrogate, the autoencoder, and the sensitivity classifier, and writes all figures, CSV summaries, and the JSON summary used in this paper. paper3_lbnl_real_pmu_summary.py optionally converts a local clone of the LBNL PMU Event Library into the repository's real-PMU schema and generates Figure 5 plus a JSON summary. paper3_assemble_docx.py (this script) builds the Word document from those artifacts. The synthetic benchmark scripts are deterministic (the random seed is fixed at 20260908) and run in a sandboxed Linux environment with Python 3.12.14, scikit-learn 1.5.2, scipy 1.14.1, pandas 2.2.3, matplotlib 3.9.2, and python-docx 1.2.0. PyTorch is not required.</w:t>
       </w:r>
     </w:p>
     <w:p>
@@ -3380,6 +4221,20 @@
           <w:sz w:val="24"/>
         </w:rPr>
         <w:t>To reproduce the results from a repository clone, run the two scripts in sequence from the repository root: `python scripts/paper3_cnnlstm_model_validation.py` produces the figures and tables under figures/, and `python scripts/paper3_assemble_docx.py` produces the Word document at papers/CNNLSTM_ModelValidation_MOD026_AcademicPaper_2026-09-08.docx. The expected wall-clock time for the simulation script is approximately 90 s on a single CPU core; the assembly script completes in a few seconds. The figures are saved at 300 DPI in PNG format and are sized to fit a 6-inch column width.</w:t>
+      </w:r>
+    </w:p>
+    <w:p>
+      <w:pPr>
+        <w:jc w:val="both"/>
+      </w:pPr>
+      <w:r>
+        <w:rPr>
+          <w:rFonts w:ascii="Times New Roman" w:hAnsi="Times New Roman"/>
+          <w:b w:val="0"/>
+          <w:i w:val="0"/>
+          <w:sz w:val="24"/>
+        </w:rPr>
+        <w:t>To reproduce the real-PMU case study, first clone the external LBNL archive outside this repository with `git clone https://github.com/LBNL-ETA/pmu_event_library.git`, then run `python scripts/paper3_lbnl_real_pmu_summary.py /path/to/pmu_event_library`. This writes figures/paper3_lbnl_real_pmu_summary.json, figures/paper3_fig5_lbnl_real_pmu_summary.png, and data/real_pmu/lbnl_sample_normalized.csv. The raw LBNL archive is not vendored into this repository; the paper cites the source and records the converter used to normalize it.</w:t>
       </w:r>
     </w:p>
     <w:p>

</xml_diff>